<commit_message>
Point manuscript and README at the v1.0 Zenodo record (10.5281/zenodo.22325911)
</commit_message>
<xml_diff>
--- a/manuscript/word_submission/Manuscript_CTEP_submission.docx
+++ b/manuscript/word_submission/Manuscript_CTEP_submission.docx
@@ -541,7 +541,7 @@
         <w:pStyle w:val="FirstParagraph"/>
       </w:pPr>
       <w:r>
-        <w:t>All eligibility decisions were independently verified by the co-authors as described above, adjudication authority rested with the authors, and every quantitative claim in this review traces to a released, machine-readable artifact (screening ledger with per-record reason codes, coded corpus with duplicate flags, cluster-audit tables, duplicate-audit evidence, and analysis scripts), archived at Zenodo (v1.1, https://doi.org/10.5281/zenodo.22319864) with anonymised reviewer access available without request.</w:t>
+        <w:t>All eligibility decisions were independently verified by the co-authors as described above, adjudication authority rested with the authors, and every quantitative claim in this review traces to a released, machine-readable artifact (screening ledger with per-record reason codes, coded corpus with duplicate flags, cluster-audit tables, duplicate-audit evidence, and analysis scripts), archived at Zenodo (v1.0, https://doi.org/10.5281/zenodo.22325911) with anonymised reviewer access available without request.</w:t>
       </w:r>
     </w:p>
     <w:p>
@@ -14641,7 +14641,7 @@
         <w:t xml:space="preserve"> </w:t>
       </w:r>
       <w:r>
-        <w:t xml:space="preserve">The complete research artifact — screening ledger with per-record decision codes, the coded corpus (729 records, 677 unique studies, duplicates flagged), duplicate-audit evidence, cluster-audit tables (physics integration; carbon/LCA), extraction files, figures, tables, and analysis scripts — is permanently archived at Zenodo (version v1.1, https://doi.org/10.5281/zenodo.22319864) and maintained at https://github.com/vnageshwaran-de/geopolymer-ai-review-artifact (release v1.1; repository private during review). The Zenodo record provides editors and reviewers direct access throughout review, with no request step required.</w:t>
+        <w:t>The complete research artifact — screening ledger with per-record decision codes, the coded corpus (729 records, 677 unique studies, duplicates flagged), duplicate-audit evidence, cluster-audit tables (physics integration; carbon/LCA), extraction files, figures, tables, and analysis scripts — is permanently archived at Zenodo (version v1.0, https://doi.org/10.5281/zenodo.22325911) and maintained at https://github.com/vnageshwaran-de/geopolymer-review-artifact-clean (release v1.0). The Zenodo record provides editors and reviewers direct access throughout review, with no request step required.</w:t>
       </w:r>
     </w:p>
     <w:p>

</xml_diff>